<commit_message>
add second practik of IT
</commit_message>
<xml_diff>
--- a/ПРАКТИКА инфор.технологии/Практика 1.docx
+++ b/ПРАКТИКА инфор.технологии/Практика 1.docx
@@ -4,18 +4,577 @@
   <w:body>
     <w:p>
       <w:pPr>
-        <w:rPr>
-          <w:rFonts w:ascii="Times New Roman" w:hAnsi="Times New Roman" w:cs="Times New Roman"/>
-          <w:caps/>
-          <w:sz w:val="28"/>
-        </w:rPr>
-      </w:pPr>
-      <w:r>
-        <w:rPr>
-          <w:rFonts w:ascii="Times New Roman" w:hAnsi="Times New Roman" w:cs="Times New Roman"/>
-          <w:caps/>
-          <w:sz w:val="28"/>
-        </w:rPr>
+        <w:spacing w:after="0" w:line="360" w:lineRule="auto"/>
+        <w:ind w:firstLine="709"/>
+        <w:jc w:val="center"/>
+        <w:rPr>
+          <w:rFonts w:ascii="Times New Roman" w:hAnsi="Times New Roman" w:cs="Times New Roman"/>
+          <w:color w:val="000000" w:themeColor="text1"/>
+        </w:rPr>
+      </w:pPr>
+      <w:r>
+        <w:rPr>
+          <w:rFonts w:ascii="Times New Roman" w:hAnsi="Times New Roman" w:cs="Times New Roman"/>
+          <w:color w:val="000000" w:themeColor="text1"/>
+        </w:rPr>
+        <w:t>МИНИСТЕРСТВО НАУКИ И ВЫСШЕГО ОБРАЗОВАНИЯ РОССИЙСКОЙ ФЕДЕРАЦИИ</w:t>
+      </w:r>
+    </w:p>
+    <w:p>
+      <w:pPr>
+        <w:spacing w:after="0" w:line="360" w:lineRule="auto"/>
+        <w:ind w:firstLine="709"/>
+        <w:jc w:val="center"/>
+        <w:rPr>
+          <w:rFonts w:ascii="Times New Roman" w:hAnsi="Times New Roman" w:cs="Times New Roman"/>
+          <w:b/>
+          <w:bCs/>
+          <w:color w:val="000000" w:themeColor="text1"/>
+        </w:rPr>
+      </w:pPr>
+      <w:r>
+        <w:rPr>
+          <w:rFonts w:ascii="Times New Roman" w:hAnsi="Times New Roman" w:cs="Times New Roman"/>
+          <w:b/>
+          <w:bCs/>
+          <w:color w:val="000000" w:themeColor="text1"/>
+        </w:rPr>
+        <w:t>Федеральное государственное бюджетное образовательное учреждение</w:t>
+      </w:r>
+    </w:p>
+    <w:p>
+      <w:pPr>
+        <w:spacing w:after="0" w:line="360" w:lineRule="auto"/>
+        <w:ind w:firstLine="709"/>
+        <w:jc w:val="center"/>
+        <w:rPr>
+          <w:rFonts w:ascii="Times New Roman" w:hAnsi="Times New Roman" w:cs="Times New Roman"/>
+          <w:b/>
+          <w:bCs/>
+          <w:color w:val="000000" w:themeColor="text1"/>
+        </w:rPr>
+      </w:pPr>
+      <w:r>
+        <w:rPr>
+          <w:rFonts w:ascii="Times New Roman" w:hAnsi="Times New Roman" w:cs="Times New Roman"/>
+          <w:b/>
+          <w:bCs/>
+          <w:color w:val="000000" w:themeColor="text1"/>
+        </w:rPr>
+        <w:t>высшего образования</w:t>
+      </w:r>
+    </w:p>
+    <w:p>
+      <w:pPr>
+        <w:spacing w:after="0" w:line="360" w:lineRule="auto"/>
+        <w:ind w:firstLine="709"/>
+        <w:jc w:val="center"/>
+        <w:rPr>
+          <w:rFonts w:ascii="Times New Roman" w:hAnsi="Times New Roman" w:cs="Times New Roman"/>
+          <w:b/>
+          <w:bCs/>
+          <w:color w:val="000000" w:themeColor="text1"/>
+        </w:rPr>
+      </w:pPr>
+      <w:r>
+        <w:rPr>
+          <w:rFonts w:ascii="Times New Roman" w:hAnsi="Times New Roman" w:cs="Times New Roman"/>
+          <w:b/>
+          <w:bCs/>
+          <w:color w:val="000000" w:themeColor="text1"/>
+        </w:rPr>
+        <w:t>«Вятский государственный университет»</w:t>
+      </w:r>
+    </w:p>
+    <w:p>
+      <w:pPr>
+        <w:spacing w:after="800" w:line="360" w:lineRule="auto"/>
+        <w:ind w:firstLine="709"/>
+        <w:jc w:val="center"/>
+        <w:rPr>
+          <w:rFonts w:ascii="Times New Roman" w:hAnsi="Times New Roman" w:cs="Times New Roman"/>
+          <w:b/>
+          <w:bCs/>
+          <w:color w:val="000000" w:themeColor="text1"/>
+        </w:rPr>
+      </w:pPr>
+      <w:r>
+        <w:rPr>
+          <w:rFonts w:ascii="Times New Roman" w:hAnsi="Times New Roman" w:cs="Times New Roman"/>
+          <w:b/>
+          <w:bCs/>
+          <w:color w:val="000000" w:themeColor="text1"/>
+        </w:rPr>
+        <w:t xml:space="preserve">Колледж </w:t>
+      </w:r>
+      <w:proofErr w:type="spellStart"/>
+      <w:r>
+        <w:rPr>
+          <w:rFonts w:ascii="Times New Roman" w:hAnsi="Times New Roman" w:cs="Times New Roman"/>
+          <w:b/>
+          <w:bCs/>
+          <w:color w:val="000000" w:themeColor="text1"/>
+        </w:rPr>
+        <w:t>ВятГУ</w:t>
+      </w:r>
+      <w:proofErr w:type="spellEnd"/>
+    </w:p>
+    <w:p>
+      <w:pPr>
+        <w:spacing w:after="0" w:line="360" w:lineRule="auto"/>
+        <w:jc w:val="center"/>
+        <w:rPr>
+          <w:rFonts w:ascii="Times New Roman" w:hAnsi="Times New Roman" w:cs="Times New Roman"/>
+          <w:b/>
+          <w:bCs/>
+          <w:color w:val="000000" w:themeColor="text1"/>
+          <w:sz w:val="28"/>
+          <w:szCs w:val="28"/>
+        </w:rPr>
+      </w:pPr>
+      <w:r>
+        <w:rPr>
+          <w:rFonts w:ascii="Times New Roman" w:hAnsi="Times New Roman" w:cs="Times New Roman"/>
+          <w:b/>
+          <w:bCs/>
+          <w:color w:val="000000" w:themeColor="text1"/>
+          <w:sz w:val="28"/>
+          <w:szCs w:val="28"/>
+        </w:rPr>
+        <w:t>ОТЧЕТ</w:t>
+      </w:r>
+    </w:p>
+    <w:p>
+      <w:pPr>
+        <w:spacing w:after="0" w:line="360" w:lineRule="auto"/>
+        <w:jc w:val="center"/>
+        <w:rPr>
+          <w:rFonts w:ascii="Times New Roman" w:hAnsi="Times New Roman" w:cs="Times New Roman"/>
+          <w:b/>
+          <w:bCs/>
+          <w:color w:val="000000" w:themeColor="text1"/>
+          <w:sz w:val="28"/>
+          <w:szCs w:val="28"/>
+        </w:rPr>
+      </w:pPr>
+      <w:r>
+        <w:rPr>
+          <w:rFonts w:ascii="Times New Roman" w:hAnsi="Times New Roman" w:cs="Times New Roman"/>
+          <w:b/>
+          <w:bCs/>
+          <w:color w:val="000000" w:themeColor="text1"/>
+          <w:sz w:val="28"/>
+          <w:szCs w:val="28"/>
+        </w:rPr>
+        <w:t>ПО ПРАКТИЧЕСКОЙ РАБОТЕ №1</w:t>
+      </w:r>
+    </w:p>
+    <w:p>
+      <w:pPr>
+        <w:spacing w:after="0" w:line="360" w:lineRule="auto"/>
+        <w:jc w:val="center"/>
+        <w:rPr>
+          <w:rFonts w:ascii="Times New Roman" w:hAnsi="Times New Roman" w:cs="Times New Roman"/>
+          <w:b/>
+          <w:bCs/>
+          <w:color w:val="000000" w:themeColor="text1"/>
+          <w:sz w:val="28"/>
+          <w:szCs w:val="28"/>
+        </w:rPr>
+      </w:pPr>
+      <w:r>
+        <w:rPr>
+          <w:rFonts w:ascii="Times New Roman" w:hAnsi="Times New Roman" w:cs="Times New Roman"/>
+          <w:b/>
+          <w:bCs/>
+          <w:color w:val="000000" w:themeColor="text1"/>
+          <w:sz w:val="28"/>
+          <w:szCs w:val="28"/>
+        </w:rPr>
+        <w:t>«Создание и редактирование текстового документа. Форматирование символа, абзаца»</w:t>
+      </w:r>
+    </w:p>
+    <w:p>
+      <w:pPr>
+        <w:spacing w:after="0" w:line="360" w:lineRule="auto"/>
+        <w:jc w:val="center"/>
+        <w:rPr>
+          <w:rFonts w:ascii="Times New Roman" w:eastAsia="Calibri" w:hAnsi="Times New Roman" w:cs="Times New Roman"/>
+          <w:color w:val="000000" w:themeColor="text1"/>
+          <w:sz w:val="28"/>
+          <w:szCs w:val="28"/>
+        </w:rPr>
+      </w:pPr>
+      <w:r>
+        <w:rPr>
+          <w:rFonts w:ascii="Times New Roman" w:hAnsi="Times New Roman" w:cs="Times New Roman"/>
+          <w:b/>
+          <w:bCs/>
+          <w:color w:val="000000" w:themeColor="text1"/>
+          <w:sz w:val="28"/>
+          <w:szCs w:val="28"/>
+        </w:rPr>
+        <w:t>«Информационные технологии»</w:t>
+      </w:r>
+    </w:p>
+    <w:p>
+      <w:pPr>
+        <w:tabs>
+          <w:tab w:val="left" w:pos="1134"/>
+        </w:tabs>
+        <w:spacing w:after="0" w:line="360" w:lineRule="auto"/>
+        <w:ind w:firstLine="709"/>
+        <w:rPr>
+          <w:rFonts w:ascii="Times New Roman" w:eastAsia="Calibri" w:hAnsi="Times New Roman" w:cs="Times New Roman"/>
+          <w:color w:val="000000" w:themeColor="text1"/>
+          <w:sz w:val="28"/>
+          <w:szCs w:val="28"/>
+        </w:rPr>
+      </w:pPr>
+      <w:r>
+        <w:rPr>
+          <w:rFonts w:ascii="Times New Roman" w:eastAsia="Calibri" w:hAnsi="Times New Roman" w:cs="Times New Roman"/>
+          <w:color w:val="000000" w:themeColor="text1"/>
+          <w:sz w:val="28"/>
+          <w:szCs w:val="28"/>
+        </w:rPr>
+        <w:t>Цель: Закрепление практических навыков по созданию, сохранению текстового документа, набору и редактированию текстов, форматированию символов и абзацев.</w:t>
+      </w:r>
+    </w:p>
+    <w:p>
+      <w:pPr>
+        <w:tabs>
+          <w:tab w:val="left" w:pos="1134"/>
+        </w:tabs>
+        <w:suppressAutoHyphens/>
+        <w:spacing w:after="0" w:line="360" w:lineRule="auto"/>
+        <w:ind w:firstLine="709"/>
+        <w:jc w:val="right"/>
+        <w:rPr>
+          <w:rFonts w:ascii="Times New Roman" w:eastAsia="Times New Roman" w:hAnsi="Times New Roman" w:cs="Times New Roman"/>
+          <w:color w:val="000000" w:themeColor="text1"/>
+          <w:sz w:val="28"/>
+          <w:szCs w:val="28"/>
+          <w:lang w:eastAsia="zh-CN"/>
+        </w:rPr>
+      </w:pPr>
+    </w:p>
+    <w:tbl>
+      <w:tblPr>
+        <w:tblStyle w:val="ac"/>
+        <w:tblW w:w="0" w:type="auto"/>
+        <w:tblBorders>
+          <w:top w:val="none" w:sz="0" w:space="0" w:color="auto"/>
+          <w:left w:val="none" w:sz="0" w:space="0" w:color="auto"/>
+          <w:bottom w:val="none" w:sz="0" w:space="0" w:color="auto"/>
+          <w:right w:val="none" w:sz="0" w:space="0" w:color="auto"/>
+          <w:insideH w:val="none" w:sz="0" w:space="0" w:color="auto"/>
+          <w:insideV w:val="none" w:sz="0" w:space="0" w:color="auto"/>
+        </w:tblBorders>
+        <w:tblLook w:val="04A0" w:firstRow="1" w:lastRow="0" w:firstColumn="1" w:lastColumn="0" w:noHBand="0" w:noVBand="1"/>
+      </w:tblPr>
+      <w:tblGrid>
+        <w:gridCol w:w="5529"/>
+        <w:gridCol w:w="3816"/>
+      </w:tblGrid>
+      <w:tr>
+        <w:tc>
+          <w:tcPr>
+            <w:tcW w:w="5529" w:type="dxa"/>
+          </w:tcPr>
+          <w:p>
+            <w:pPr>
+              <w:tabs>
+                <w:tab w:val="left" w:pos="1134"/>
+              </w:tabs>
+              <w:suppressAutoHyphens/>
+              <w:spacing w:line="360" w:lineRule="auto"/>
+              <w:jc w:val="right"/>
+              <w:rPr>
+                <w:rFonts w:ascii="Times New Roman" w:eastAsia="Times New Roman" w:hAnsi="Times New Roman" w:cs="Times New Roman"/>
+                <w:color w:val="000000" w:themeColor="text1"/>
+                <w:sz w:val="28"/>
+                <w:szCs w:val="28"/>
+                <w:lang w:eastAsia="zh-CN"/>
+              </w:rPr>
+            </w:pPr>
+          </w:p>
+        </w:tc>
+        <w:tc>
+          <w:tcPr>
+            <w:tcW w:w="3816" w:type="dxa"/>
+          </w:tcPr>
+          <w:p>
+            <w:pPr>
+              <w:tabs>
+                <w:tab w:val="left" w:pos="1134"/>
+              </w:tabs>
+              <w:spacing w:line="360" w:lineRule="auto"/>
+              <w:rPr>
+                <w:rFonts w:ascii="Times New Roman" w:eastAsia="Calibri" w:hAnsi="Times New Roman" w:cs="Times New Roman"/>
+                <w:color w:val="000000" w:themeColor="text1"/>
+                <w:sz w:val="28"/>
+                <w:szCs w:val="28"/>
+              </w:rPr>
+            </w:pPr>
+            <w:r>
+              <w:rPr>
+                <w:rFonts w:ascii="Times New Roman" w:eastAsia="Calibri" w:hAnsi="Times New Roman" w:cs="Times New Roman"/>
+                <w:color w:val="000000" w:themeColor="text1"/>
+                <w:sz w:val="28"/>
+                <w:szCs w:val="28"/>
+              </w:rPr>
+              <w:t>Выполнили</w:t>
+            </w:r>
+            <w:r>
+              <w:rPr>
+                <w:rFonts w:ascii="Times New Roman" w:eastAsia="Calibri" w:hAnsi="Times New Roman" w:cs="Times New Roman"/>
+                <w:color w:val="000000" w:themeColor="text1"/>
+                <w:sz w:val="28"/>
+                <w:szCs w:val="28"/>
+              </w:rPr>
+              <w:t xml:space="preserve"> студенты группы:</w:t>
+            </w:r>
+          </w:p>
+          <w:p>
+            <w:pPr>
+              <w:tabs>
+                <w:tab w:val="left" w:pos="1134"/>
+              </w:tabs>
+              <w:spacing w:line="360" w:lineRule="auto"/>
+              <w:rPr>
+                <w:rFonts w:ascii="Times New Roman" w:eastAsia="Calibri" w:hAnsi="Times New Roman" w:cs="Times New Roman"/>
+                <w:color w:val="000000" w:themeColor="text1"/>
+                <w:sz w:val="28"/>
+                <w:szCs w:val="28"/>
+              </w:rPr>
+            </w:pPr>
+            <w:proofErr w:type="spellStart"/>
+            <w:r>
+              <w:rPr>
+                <w:rFonts w:ascii="Times New Roman" w:eastAsia="Calibri" w:hAnsi="Times New Roman" w:cs="Times New Roman"/>
+                <w:color w:val="000000" w:themeColor="text1"/>
+                <w:sz w:val="28"/>
+                <w:szCs w:val="28"/>
+              </w:rPr>
+              <w:t>ИСПк</w:t>
+            </w:r>
+            <w:proofErr w:type="spellEnd"/>
+            <w:r>
+              <w:rPr>
+                <w:rFonts w:ascii="Times New Roman" w:eastAsia="Calibri" w:hAnsi="Times New Roman" w:cs="Times New Roman"/>
+                <w:color w:val="000000" w:themeColor="text1"/>
+                <w:sz w:val="28"/>
+                <w:szCs w:val="28"/>
+              </w:rPr>
+              <w:t xml:space="preserve"> 203-52-00</w:t>
+            </w:r>
+          </w:p>
+          <w:p>
+            <w:pPr>
+              <w:tabs>
+                <w:tab w:val="left" w:pos="1134"/>
+              </w:tabs>
+              <w:spacing w:line="360" w:lineRule="auto"/>
+              <w:rPr>
+                <w:rFonts w:ascii="Times New Roman" w:eastAsia="Calibri" w:hAnsi="Times New Roman" w:cs="Times New Roman"/>
+                <w:color w:val="000000" w:themeColor="text1"/>
+                <w:sz w:val="28"/>
+                <w:szCs w:val="28"/>
+              </w:rPr>
+            </w:pPr>
+            <w:r>
+              <w:rPr>
+                <w:rFonts w:ascii="Times New Roman" w:eastAsia="Calibri" w:hAnsi="Times New Roman" w:cs="Times New Roman"/>
+                <w:color w:val="000000" w:themeColor="text1"/>
+                <w:sz w:val="28"/>
+                <w:szCs w:val="28"/>
+              </w:rPr>
+              <w:t>Шильников Максим Юрьевич</w:t>
+            </w:r>
+          </w:p>
+          <w:p>
+            <w:pPr>
+              <w:tabs>
+                <w:tab w:val="left" w:pos="1134"/>
+              </w:tabs>
+              <w:spacing w:line="360" w:lineRule="auto"/>
+              <w:rPr>
+                <w:rFonts w:ascii="Times New Roman" w:eastAsia="Calibri" w:hAnsi="Times New Roman" w:cs="Times New Roman"/>
+                <w:color w:val="000000" w:themeColor="text1"/>
+                <w:sz w:val="28"/>
+                <w:szCs w:val="28"/>
+              </w:rPr>
+            </w:pPr>
+            <w:r>
+              <w:rPr>
+                <w:rFonts w:ascii="Times New Roman" w:eastAsia="Calibri" w:hAnsi="Times New Roman" w:cs="Times New Roman"/>
+                <w:color w:val="000000" w:themeColor="text1"/>
+                <w:sz w:val="28"/>
+                <w:szCs w:val="28"/>
+              </w:rPr>
+              <w:t>Пестов Степан Иванович</w:t>
+            </w:r>
+          </w:p>
+          <w:p>
+            <w:pPr>
+              <w:tabs>
+                <w:tab w:val="left" w:pos="1134"/>
+              </w:tabs>
+              <w:spacing w:line="360" w:lineRule="auto"/>
+              <w:rPr>
+                <w:rFonts w:ascii="Times New Roman" w:eastAsia="Calibri" w:hAnsi="Times New Roman" w:cs="Times New Roman"/>
+                <w:color w:val="000000" w:themeColor="text1"/>
+                <w:sz w:val="28"/>
+                <w:szCs w:val="28"/>
+              </w:rPr>
+            </w:pPr>
+          </w:p>
+          <w:p>
+            <w:pPr>
+              <w:tabs>
+                <w:tab w:val="left" w:pos="1134"/>
+              </w:tabs>
+              <w:spacing w:line="360" w:lineRule="auto"/>
+              <w:jc w:val="both"/>
+              <w:rPr>
+                <w:rFonts w:ascii="Times New Roman" w:eastAsia="Calibri" w:hAnsi="Times New Roman" w:cs="Times New Roman"/>
+                <w:color w:val="000000" w:themeColor="text1"/>
+                <w:sz w:val="28"/>
+                <w:szCs w:val="28"/>
+              </w:rPr>
+            </w:pPr>
+            <w:r>
+              <w:rPr>
+                <w:rFonts w:ascii="Times New Roman" w:eastAsia="Calibri" w:hAnsi="Times New Roman" w:cs="Times New Roman"/>
+                <w:color w:val="000000" w:themeColor="text1"/>
+                <w:sz w:val="28"/>
+                <w:szCs w:val="28"/>
+              </w:rPr>
+              <w:t>Преподаватель</w:t>
+            </w:r>
+            <w:r>
+              <w:rPr>
+                <w:rFonts w:ascii="Times New Roman" w:eastAsia="Calibri" w:hAnsi="Times New Roman" w:cs="Times New Roman"/>
+                <w:color w:val="000000" w:themeColor="text1"/>
+                <w:sz w:val="28"/>
+                <w:szCs w:val="28"/>
+              </w:rPr>
+              <w:t>:</w:t>
+            </w:r>
+          </w:p>
+          <w:p>
+            <w:pPr>
+              <w:tabs>
+                <w:tab w:val="left" w:pos="1134"/>
+              </w:tabs>
+              <w:spacing w:line="360" w:lineRule="auto"/>
+              <w:jc w:val="both"/>
+              <w:rPr>
+                <w:rFonts w:ascii="Times New Roman" w:eastAsia="Calibri" w:hAnsi="Times New Roman" w:cs="Times New Roman"/>
+                <w:color w:val="000000" w:themeColor="text1"/>
+                <w:sz w:val="28"/>
+                <w:szCs w:val="28"/>
+              </w:rPr>
+            </w:pPr>
+            <w:r>
+              <w:rPr>
+                <w:rFonts w:ascii="Times New Roman" w:eastAsia="Calibri" w:hAnsi="Times New Roman" w:cs="Times New Roman"/>
+                <w:color w:val="000000" w:themeColor="text1"/>
+                <w:sz w:val="28"/>
+                <w:szCs w:val="28"/>
+              </w:rPr>
+              <w:t xml:space="preserve">Жилова </w:t>
+            </w:r>
+            <w:proofErr w:type="gramStart"/>
+            <w:r>
+              <w:rPr>
+                <w:rFonts w:ascii="Times New Roman" w:eastAsia="Calibri" w:hAnsi="Times New Roman" w:cs="Times New Roman"/>
+                <w:color w:val="000000" w:themeColor="text1"/>
+                <w:sz w:val="28"/>
+                <w:szCs w:val="28"/>
+              </w:rPr>
+              <w:t>Ю.А</w:t>
+            </w:r>
+            <w:proofErr w:type="gramEnd"/>
+          </w:p>
+          <w:p>
+            <w:pPr>
+              <w:tabs>
+                <w:tab w:val="left" w:pos="1134"/>
+              </w:tabs>
+              <w:suppressAutoHyphens/>
+              <w:spacing w:line="360" w:lineRule="auto"/>
+              <w:rPr>
+                <w:rFonts w:ascii="Times New Roman" w:eastAsia="Times New Roman" w:hAnsi="Times New Roman" w:cs="Times New Roman"/>
+                <w:color w:val="000000" w:themeColor="text1"/>
+                <w:sz w:val="28"/>
+                <w:szCs w:val="28"/>
+                <w:lang w:eastAsia="zh-CN"/>
+              </w:rPr>
+            </w:pPr>
+          </w:p>
+        </w:tc>
+      </w:tr>
+    </w:tbl>
+    <w:p>
+      <w:pPr>
+        <w:tabs>
+          <w:tab w:val="left" w:pos="1134"/>
+        </w:tabs>
+        <w:spacing w:after="1000" w:line="360" w:lineRule="auto"/>
+        <w:rPr>
+          <w:rFonts w:ascii="Times New Roman" w:eastAsia="Calibri" w:hAnsi="Times New Roman" w:cs="Times New Roman"/>
+          <w:color w:val="000000" w:themeColor="text1"/>
+          <w:sz w:val="28"/>
+          <w:szCs w:val="28"/>
+        </w:rPr>
+      </w:pPr>
+    </w:p>
+    <w:p>
+      <w:pPr>
+        <w:jc w:val="center"/>
+        <w:rPr>
+          <w:rFonts w:ascii="Times New Roman" w:hAnsi="Times New Roman" w:cs="Times New Roman"/>
+          <w:caps/>
+          <w:sz w:val="28"/>
+        </w:rPr>
+      </w:pPr>
+      <w:r>
+        <w:rPr>
+          <w:rFonts w:ascii="Times New Roman" w:eastAsia="Times New Roman" w:hAnsi="Times New Roman" w:cs="Times New Roman"/>
+          <w:color w:val="000000" w:themeColor="text1"/>
+          <w:spacing w:val="13"/>
+          <w:sz w:val="28"/>
+          <w:szCs w:val="28"/>
+          <w:lang w:eastAsia="zh-CN"/>
+        </w:rPr>
+        <w:t>Киров 2025 г.</w:t>
+      </w:r>
+      <w:r>
+        <w:rPr>
+          <w:rFonts w:ascii="Times New Roman" w:hAnsi="Times New Roman" w:cs="Times New Roman"/>
+          <w:caps/>
+          <w:sz w:val="28"/>
+        </w:rPr>
+        <w:br w:type="page"/>
+      </w:r>
+    </w:p>
+    <w:p>
+      <w:pPr>
+        <w:rPr>
+          <w:rFonts w:ascii="Times New Roman" w:hAnsi="Times New Roman" w:cs="Times New Roman"/>
+          <w:caps/>
+          <w:sz w:val="28"/>
+        </w:rPr>
+      </w:pPr>
+      <w:r>
+        <w:rPr>
+          <w:rFonts w:ascii="Times New Roman" w:hAnsi="Times New Roman" w:cs="Times New Roman"/>
+          <w:caps/>
+          <w:sz w:val="28"/>
+        </w:rPr>
+        <w:lastRenderedPageBreak/>
         <w:t>№ 1.</w:t>
       </w:r>
     </w:p>
@@ -449,6 +1008,12 @@
           <w:sz w:val="28"/>
         </w:rPr>
         <w:sectPr>
+          <w:headerReference w:type="even" r:id="rId8"/>
+          <w:headerReference w:type="default" r:id="rId9"/>
+          <w:footerReference w:type="even" r:id="rId10"/>
+          <w:footerReference w:type="default" r:id="rId11"/>
+          <w:headerReference w:type="first" r:id="rId12"/>
+          <w:footerReference w:type="first" r:id="rId13"/>
           <w:pgSz w:w="11906" w:h="16838"/>
           <w:pgMar w:top="1134" w:right="850" w:bottom="1134" w:left="1701" w:header="708" w:footer="708" w:gutter="0"/>
           <w:cols w:space="708"/>
@@ -1692,6 +2257,7 @@
           <w:rFonts w:ascii="Times New Roman" w:hAnsi="Times New Roman" w:cs="Times New Roman"/>
           <w:sz w:val="28"/>
         </w:rPr>
+        <w:lastRenderedPageBreak/>
         <w:t xml:space="preserve">Цикл с предусловием </w:t>
       </w:r>
     </w:p>
@@ -1713,7 +2279,6 @@
           <w:rFonts w:ascii="Times New Roman" w:hAnsi="Times New Roman" w:cs="Times New Roman"/>
           <w:sz w:val="28"/>
         </w:rPr>
-        <w:lastRenderedPageBreak/>
         <w:t>Цикл с постусловием</w:t>
       </w:r>
       <w:r>
@@ -4009,7 +4574,7 @@
                       <wp:cNvGraphicFramePr/>
                       <a:graphic xmlns:a="http://schemas.openxmlformats.org/drawingml/2006/main">
                         <a:graphicData uri="http://schemas.microsoft.com/office/word/2010/wordprocessingInk">
-                          <w14:contentPart bwMode="auto" r:id="rId6">
+                          <w14:contentPart bwMode="auto" r:id="rId14">
                             <w14:nvContentPartPr>
                               <w14:cNvContentPartPr/>
                             </w14:nvContentPartPr>
@@ -4026,7 +4591,7 @@
                 <mc:Fallback>
                   <w:pict>
                     <v:shape w14:anchorId="3398BD97" id="Рукописный ввод 1" o:spid="_x0000_s1026" type="#_x0000_t75" style="position:absolute;margin-left:1.05pt;margin-top:-14.55pt;width:89.8pt;height:38.8pt;z-index:251659264;visibility:visible;mso-wrap-style:square;mso-wrap-distance-left:9pt;mso-wrap-distance-top:0;mso-wrap-distance-right:9pt;mso-wrap-distance-bottom:0;mso-position-horizontal:absolute;mso-position-horizontal-relative:text;mso-position-vertical:absolute;mso-position-vertical-relative:text" o:gfxdata="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">
-                      <v:imagedata r:id="rId7" o:title=""/>
+                      <v:imagedata r:id="rId15" o:title=""/>
                     </v:shape>
                   </w:pict>
                 </mc:Fallback>
@@ -4093,6 +4658,121 @@
     </w:sectPr>
   </w:body>
 </w:document>
+</file>
+
+<file path=word/endnotes.xml><?xml version="1.0" encoding="utf-8"?>
+<w:endnotes xmlns:wpc="http://schemas.microsoft.com/office/word/2010/wordprocessingCanvas" xmlns:cx="http://schemas.microsoft.com/office/drawing/2014/chartex" xmlns:cx1="http://schemas.microsoft.com/office/drawing/2015/9/8/chartex" xmlns:cx2="http://schemas.microsoft.com/office/drawing/2015/10/21/chartex" xmlns:cx3="http://schemas.microsoft.com/office/drawing/2016/5/9/chartex" xmlns:cx4="http://schemas.microsoft.com/office/drawing/2016/5/10/chartex" xmlns:cx5="http://schemas.microsoft.com/office/drawing/2016/5/11/chartex" xmlns:cx6="http://schemas.microsoft.com/office/drawing/2016/5/12/chartex" xmlns:cx7="http://schemas.microsoft.com/office/drawing/2016/5/13/chartex" xmlns:cx8="http://schemas.microsoft.com/office/drawing/2016/5/14/chartex" xmlns:mc="http://schemas.openxmlformats.org/markup-compatibility/2006" xmlns:aink="http://schemas.microsoft.com/office/drawing/2016/ink" xmlns:am3d="http://schemas.microsoft.com/office/drawing/2017/model3d" xmlns:o="urn:schemas-microsoft-com:office:office" xmlns:oel="http://schemas.microsoft.com/office/2019/extlst" xmlns:r="http://schemas.openxmlformats.org/officeDocument/2006/relationships" xmlns:m="http://schemas.openxmlformats.org/officeDocument/2006/math" xmlns:v="urn:schemas-microsoft-com:vml" xmlns:wp14="http://schemas.microsoft.com/office/word/2010/wordprocessingDrawing" xmlns:wp="http://schemas.openxmlformats.org/drawingml/2006/wordprocessingDrawing" xmlns:w10="urn:schemas-microsoft-com:office:word" xmlns:w="http://schemas.openxmlformats.org/wordprocessingml/2006/main" xmlns:w14="http://schemas.microsoft.com/office/word/2010/wordml" xmlns:w15="http://schemas.microsoft.com/office/word/2012/wordml" xmlns:w16cex="http://schemas.microsoft.com/office/word/2018/wordml/cex" xmlns:w16cid="http://schemas.microsoft.com/office/word/2016/wordml/cid" xmlns:w16="http://schemas.microsoft.com/office/word/2018/wordml" xmlns:w16du="http://schemas.microsoft.com/office/word/2023/wordml/word16du" xmlns:w16sdtdh="http://schemas.microsoft.com/office/word/2020/wordml/sdtdatahash" xmlns:w16sdtfl="http://schemas.microsoft.com/office/word/2024/wordml/sdtformatlock" xmlns:w16se="http://schemas.microsoft.com/office/word/2015/wordml/symex" xmlns:wpg="http://schemas.microsoft.com/office/word/2010/wordprocessingGroup" xmlns:wpi="http://schemas.microsoft.com/office/word/2010/wordprocessingInk" xmlns:wne="http://schemas.microsoft.com/office/word/2006/wordml" xmlns:wps="http://schemas.microsoft.com/office/word/2010/wordprocessingShape" mc:Ignorable="w14 w15 w16se w16cid w16 w16cex w16sdtdh w16sdtfl w16du wp14">
+  <w:endnote w:type="separator" w:id="-1">
+    <w:p>
+      <w:pPr>
+        <w:spacing w:after="0" w:line="240" w:lineRule="auto"/>
+      </w:pPr>
+      <w:r>
+        <w:separator/>
+      </w:r>
+    </w:p>
+  </w:endnote>
+  <w:endnote w:type="continuationSeparator" w:id="0">
+    <w:p>
+      <w:pPr>
+        <w:spacing w:after="0" w:line="240" w:lineRule="auto"/>
+      </w:pPr>
+      <w:r>
+        <w:continuationSeparator/>
+      </w:r>
+    </w:p>
+  </w:endnote>
+</w:endnotes>
+</file>
+
+<file path=word/footer1.xml><?xml version="1.0" encoding="utf-8"?>
+<w:ftr xmlns:wpc="http://schemas.microsoft.com/office/word/2010/wordprocessingCanvas" xmlns:cx="http://schemas.microsoft.com/office/drawing/2014/chartex" xmlns:cx1="http://schemas.microsoft.com/office/drawing/2015/9/8/chartex" xmlns:cx2="http://schemas.microsoft.com/office/drawing/2015/10/21/chartex" xmlns:cx3="http://schemas.microsoft.com/office/drawing/2016/5/9/chartex" xmlns:cx4="http://schemas.microsoft.com/office/drawing/2016/5/10/chartex" xmlns:cx5="http://schemas.microsoft.com/office/drawing/2016/5/11/chartex" xmlns:cx6="http://schemas.microsoft.com/office/drawing/2016/5/12/chartex" xmlns:cx7="http://schemas.microsoft.com/office/drawing/2016/5/13/chartex" xmlns:cx8="http://schemas.microsoft.com/office/drawing/2016/5/14/chartex" xmlns:mc="http://schemas.openxmlformats.org/markup-compatibility/2006" xmlns:aink="http://schemas.microsoft.com/office/drawing/2016/ink" xmlns:am3d="http://schemas.microsoft.com/office/drawing/2017/model3d" xmlns:o="urn:schemas-microsoft-com:office:office" xmlns:oel="http://schemas.microsoft.com/office/2019/extlst" xmlns:r="http://schemas.openxmlformats.org/officeDocument/2006/relationships" xmlns:m="http://schemas.openxmlformats.org/officeDocument/2006/math" xmlns:v="urn:schemas-microsoft-com:vml" xmlns:wp14="http://schemas.microsoft.com/office/word/2010/wordprocessingDrawing" xmlns:wp="http://schemas.openxmlformats.org/drawingml/2006/wordprocessingDrawing" xmlns:w10="urn:schemas-microsoft-com:office:word" xmlns:w="http://schemas.openxmlformats.org/wordprocessingml/2006/main" xmlns:w14="http://schemas.microsoft.com/office/word/2010/wordml" xmlns:w15="http://schemas.microsoft.com/office/word/2012/wordml" xmlns:w16cex="http://schemas.microsoft.com/office/word/2018/wordml/cex" xmlns:w16cid="http://schemas.microsoft.com/office/word/2016/wordml/cid" xmlns:w16="http://schemas.microsoft.com/office/word/2018/wordml" xmlns:w16du="http://schemas.microsoft.com/office/word/2023/wordml/word16du" xmlns:w16sdtdh="http://schemas.microsoft.com/office/word/2020/wordml/sdtdatahash" xmlns:w16sdtfl="http://schemas.microsoft.com/office/word/2024/wordml/sdtformatlock" xmlns:w16se="http://schemas.microsoft.com/office/word/2015/wordml/symex" xmlns:wpg="http://schemas.microsoft.com/office/word/2010/wordprocessingGroup" xmlns:wpi="http://schemas.microsoft.com/office/word/2010/wordprocessingInk" xmlns:wne="http://schemas.microsoft.com/office/word/2006/wordml" xmlns:wps="http://schemas.microsoft.com/office/word/2010/wordprocessingShape" mc:Ignorable="w14 w15 w16se w16cid w16 w16cex w16sdtdh w16sdtfl w16du wp14">
+  <w:p>
+    <w:pPr>
+      <w:pStyle w:val="af"/>
+    </w:pPr>
+  </w:p>
+</w:ftr>
+</file>
+
+<file path=word/footer2.xml><?xml version="1.0" encoding="utf-8"?>
+<w:ftr xmlns:wpc="http://schemas.microsoft.com/office/word/2010/wordprocessingCanvas" xmlns:cx="http://schemas.microsoft.com/office/drawing/2014/chartex" xmlns:cx1="http://schemas.microsoft.com/office/drawing/2015/9/8/chartex" xmlns:cx2="http://schemas.microsoft.com/office/drawing/2015/10/21/chartex" xmlns:cx3="http://schemas.microsoft.com/office/drawing/2016/5/9/chartex" xmlns:cx4="http://schemas.microsoft.com/office/drawing/2016/5/10/chartex" xmlns:cx5="http://schemas.microsoft.com/office/drawing/2016/5/11/chartex" xmlns:cx6="http://schemas.microsoft.com/office/drawing/2016/5/12/chartex" xmlns:cx7="http://schemas.microsoft.com/office/drawing/2016/5/13/chartex" xmlns:cx8="http://schemas.microsoft.com/office/drawing/2016/5/14/chartex" xmlns:mc="http://schemas.openxmlformats.org/markup-compatibility/2006" xmlns:aink="http://schemas.microsoft.com/office/drawing/2016/ink" xmlns:am3d="http://schemas.microsoft.com/office/drawing/2017/model3d" xmlns:o="urn:schemas-microsoft-com:office:office" xmlns:oel="http://schemas.microsoft.com/office/2019/extlst" xmlns:r="http://schemas.openxmlformats.org/officeDocument/2006/relationships" xmlns:m="http://schemas.openxmlformats.org/officeDocument/2006/math" xmlns:v="urn:schemas-microsoft-com:vml" xmlns:wp14="http://schemas.microsoft.com/office/word/2010/wordprocessingDrawing" xmlns:wp="http://schemas.openxmlformats.org/drawingml/2006/wordprocessingDrawing" xmlns:w10="urn:schemas-microsoft-com:office:word" xmlns:w="http://schemas.openxmlformats.org/wordprocessingml/2006/main" xmlns:w14="http://schemas.microsoft.com/office/word/2010/wordml" xmlns:w15="http://schemas.microsoft.com/office/word/2012/wordml" xmlns:w16cex="http://schemas.microsoft.com/office/word/2018/wordml/cex" xmlns:w16cid="http://schemas.microsoft.com/office/word/2016/wordml/cid" xmlns:w16="http://schemas.microsoft.com/office/word/2018/wordml" xmlns:w16du="http://schemas.microsoft.com/office/word/2023/wordml/word16du" xmlns:w16sdtdh="http://schemas.microsoft.com/office/word/2020/wordml/sdtdatahash" xmlns:w16sdtfl="http://schemas.microsoft.com/office/word/2024/wordml/sdtformatlock" xmlns:w16se="http://schemas.microsoft.com/office/word/2015/wordml/symex" xmlns:wpg="http://schemas.microsoft.com/office/word/2010/wordprocessingGroup" xmlns:wpi="http://schemas.microsoft.com/office/word/2010/wordprocessingInk" xmlns:wne="http://schemas.microsoft.com/office/word/2006/wordml" xmlns:wps="http://schemas.microsoft.com/office/word/2010/wordprocessingShape" mc:Ignorable="w14 w15 w16se w16cid w16 w16cex w16sdtdh w16sdtfl w16du wp14">
+  <w:p>
+    <w:pPr>
+      <w:pStyle w:val="af"/>
+    </w:pPr>
+  </w:p>
+  <w:p>
+    <w:pPr>
+      <w:pStyle w:val="af"/>
+    </w:pPr>
+  </w:p>
+</w:ftr>
+</file>
+
+<file path=word/footer3.xml><?xml version="1.0" encoding="utf-8"?>
+<w:ftr xmlns:wpc="http://schemas.microsoft.com/office/word/2010/wordprocessingCanvas" xmlns:cx="http://schemas.microsoft.com/office/drawing/2014/chartex" xmlns:cx1="http://schemas.microsoft.com/office/drawing/2015/9/8/chartex" xmlns:cx2="http://schemas.microsoft.com/office/drawing/2015/10/21/chartex" xmlns:cx3="http://schemas.microsoft.com/office/drawing/2016/5/9/chartex" xmlns:cx4="http://schemas.microsoft.com/office/drawing/2016/5/10/chartex" xmlns:cx5="http://schemas.microsoft.com/office/drawing/2016/5/11/chartex" xmlns:cx6="http://schemas.microsoft.com/office/drawing/2016/5/12/chartex" xmlns:cx7="http://schemas.microsoft.com/office/drawing/2016/5/13/chartex" xmlns:cx8="http://schemas.microsoft.com/office/drawing/2016/5/14/chartex" xmlns:mc="http://schemas.openxmlformats.org/markup-compatibility/2006" xmlns:aink="http://schemas.microsoft.com/office/drawing/2016/ink" xmlns:am3d="http://schemas.microsoft.com/office/drawing/2017/model3d" xmlns:o="urn:schemas-microsoft-com:office:office" xmlns:oel="http://schemas.microsoft.com/office/2019/extlst" xmlns:r="http://schemas.openxmlformats.org/officeDocument/2006/relationships" xmlns:m="http://schemas.openxmlformats.org/officeDocument/2006/math" xmlns:v="urn:schemas-microsoft-com:vml" xmlns:wp14="http://schemas.microsoft.com/office/word/2010/wordprocessingDrawing" xmlns:wp="http://schemas.openxmlformats.org/drawingml/2006/wordprocessingDrawing" xmlns:w10="urn:schemas-microsoft-com:office:word" xmlns:w="http://schemas.openxmlformats.org/wordprocessingml/2006/main" xmlns:w14="http://schemas.microsoft.com/office/word/2010/wordml" xmlns:w15="http://schemas.microsoft.com/office/word/2012/wordml" xmlns:w16cex="http://schemas.microsoft.com/office/word/2018/wordml/cex" xmlns:w16cid="http://schemas.microsoft.com/office/word/2016/wordml/cid" xmlns:w16="http://schemas.microsoft.com/office/word/2018/wordml" xmlns:w16du="http://schemas.microsoft.com/office/word/2023/wordml/word16du" xmlns:w16sdtdh="http://schemas.microsoft.com/office/word/2020/wordml/sdtdatahash" xmlns:w16sdtfl="http://schemas.microsoft.com/office/word/2024/wordml/sdtformatlock" xmlns:w16se="http://schemas.microsoft.com/office/word/2015/wordml/symex" xmlns:wpg="http://schemas.microsoft.com/office/word/2010/wordprocessingGroup" xmlns:wpi="http://schemas.microsoft.com/office/word/2010/wordprocessingInk" xmlns:wne="http://schemas.microsoft.com/office/word/2006/wordml" xmlns:wps="http://schemas.microsoft.com/office/word/2010/wordprocessingShape" mc:Ignorable="w14 w15 w16se w16cid w16 w16cex w16sdtdh w16sdtfl w16du wp14">
+  <w:p>
+    <w:pPr>
+      <w:pStyle w:val="af"/>
+    </w:pPr>
+  </w:p>
+</w:ftr>
+</file>
+
+<file path=word/footnotes.xml><?xml version="1.0" encoding="utf-8"?>
+<w:footnotes xmlns:wpc="http://schemas.microsoft.com/office/word/2010/wordprocessingCanvas" xmlns:cx="http://schemas.microsoft.com/office/drawing/2014/chartex" xmlns:cx1="http://schemas.microsoft.com/office/drawing/2015/9/8/chartex" xmlns:cx2="http://schemas.microsoft.com/office/drawing/2015/10/21/chartex" xmlns:cx3="http://schemas.microsoft.com/office/drawing/2016/5/9/chartex" xmlns:cx4="http://schemas.microsoft.com/office/drawing/2016/5/10/chartex" xmlns:cx5="http://schemas.microsoft.com/office/drawing/2016/5/11/chartex" xmlns:cx6="http://schemas.microsoft.com/office/drawing/2016/5/12/chartex" xmlns:cx7="http://schemas.microsoft.com/office/drawing/2016/5/13/chartex" xmlns:cx8="http://schemas.microsoft.com/office/drawing/2016/5/14/chartex" xmlns:mc="http://schemas.openxmlformats.org/markup-compatibility/2006" xmlns:aink="http://schemas.microsoft.com/office/drawing/2016/ink" xmlns:am3d="http://schemas.microsoft.com/office/drawing/2017/model3d" xmlns:o="urn:schemas-microsoft-com:office:office" xmlns:oel="http://schemas.microsoft.com/office/2019/extlst" xmlns:r="http://schemas.openxmlformats.org/officeDocument/2006/relationships" xmlns:m="http://schemas.openxmlformats.org/officeDocument/2006/math" xmlns:v="urn:schemas-microsoft-com:vml" xmlns:wp14="http://schemas.microsoft.com/office/word/2010/wordprocessingDrawing" xmlns:wp="http://schemas.openxmlformats.org/drawingml/2006/wordprocessingDrawing" xmlns:w10="urn:schemas-microsoft-com:office:word" xmlns:w="http://schemas.openxmlformats.org/wordprocessingml/2006/main" xmlns:w14="http://schemas.microsoft.com/office/word/2010/wordml" xmlns:w15="http://schemas.microsoft.com/office/word/2012/wordml" xmlns:w16cex="http://schemas.microsoft.com/office/word/2018/wordml/cex" xmlns:w16cid="http://schemas.microsoft.com/office/word/2016/wordml/cid" xmlns:w16="http://schemas.microsoft.com/office/word/2018/wordml" xmlns:w16du="http://schemas.microsoft.com/office/word/2023/wordml/word16du" xmlns:w16sdtdh="http://schemas.microsoft.com/office/word/2020/wordml/sdtdatahash" xmlns:w16sdtfl="http://schemas.microsoft.com/office/word/2024/wordml/sdtformatlock" xmlns:w16se="http://schemas.microsoft.com/office/word/2015/wordml/symex" xmlns:wpg="http://schemas.microsoft.com/office/word/2010/wordprocessingGroup" xmlns:wpi="http://schemas.microsoft.com/office/word/2010/wordprocessingInk" xmlns:wne="http://schemas.microsoft.com/office/word/2006/wordml" xmlns:wps="http://schemas.microsoft.com/office/word/2010/wordprocessingShape" mc:Ignorable="w14 w15 w16se w16cid w16 w16cex w16sdtdh w16sdtfl w16du wp14">
+  <w:footnote w:type="separator" w:id="-1">
+    <w:p>
+      <w:pPr>
+        <w:spacing w:after="0" w:line="240" w:lineRule="auto"/>
+      </w:pPr>
+      <w:r>
+        <w:separator/>
+      </w:r>
+    </w:p>
+  </w:footnote>
+  <w:footnote w:type="continuationSeparator" w:id="0">
+    <w:p>
+      <w:pPr>
+        <w:spacing w:after="0" w:line="240" w:lineRule="auto"/>
+      </w:pPr>
+      <w:r>
+        <w:continuationSeparator/>
+      </w:r>
+    </w:p>
+  </w:footnote>
+</w:footnotes>
+</file>
+
+<file path=word/header1.xml><?xml version="1.0" encoding="utf-8"?>
+<w:hdr xmlns:wpc="http://schemas.microsoft.com/office/word/2010/wordprocessingCanvas" xmlns:cx="http://schemas.microsoft.com/office/drawing/2014/chartex" xmlns:cx1="http://schemas.microsoft.com/office/drawing/2015/9/8/chartex" xmlns:cx2="http://schemas.microsoft.com/office/drawing/2015/10/21/chartex" xmlns:cx3="http://schemas.microsoft.com/office/drawing/2016/5/9/chartex" xmlns:cx4="http://schemas.microsoft.com/office/drawing/2016/5/10/chartex" xmlns:cx5="http://schemas.microsoft.com/office/drawing/2016/5/11/chartex" xmlns:cx6="http://schemas.microsoft.com/office/drawing/2016/5/12/chartex" xmlns:cx7="http://schemas.microsoft.com/office/drawing/2016/5/13/chartex" xmlns:cx8="http://schemas.microsoft.com/office/drawing/2016/5/14/chartex" xmlns:mc="http://schemas.openxmlformats.org/markup-compatibility/2006" xmlns:aink="http://schemas.microsoft.com/office/drawing/2016/ink" xmlns:am3d="http://schemas.microsoft.com/office/drawing/2017/model3d" xmlns:o="urn:schemas-microsoft-com:office:office" xmlns:oel="http://schemas.microsoft.com/office/2019/extlst" xmlns:r="http://schemas.openxmlformats.org/officeDocument/2006/relationships" xmlns:m="http://schemas.openxmlformats.org/officeDocument/2006/math" xmlns:v="urn:schemas-microsoft-com:vml" xmlns:wp14="http://schemas.microsoft.com/office/word/2010/wordprocessingDrawing" xmlns:wp="http://schemas.openxmlformats.org/drawingml/2006/wordprocessingDrawing" xmlns:w10="urn:schemas-microsoft-com:office:word" xmlns:w="http://schemas.openxmlformats.org/wordprocessingml/2006/main" xmlns:w14="http://schemas.microsoft.com/office/word/2010/wordml" xmlns:w15="http://schemas.microsoft.com/office/word/2012/wordml" xmlns:w16cex="http://schemas.microsoft.com/office/word/2018/wordml/cex" xmlns:w16cid="http://schemas.microsoft.com/office/word/2016/wordml/cid" xmlns:w16="http://schemas.microsoft.com/office/word/2018/wordml" xmlns:w16du="http://schemas.microsoft.com/office/word/2023/wordml/word16du" xmlns:w16sdtdh="http://schemas.microsoft.com/office/word/2020/wordml/sdtdatahash" xmlns:w16sdtfl="http://schemas.microsoft.com/office/word/2024/wordml/sdtformatlock" xmlns:w16se="http://schemas.microsoft.com/office/word/2015/wordml/symex" xmlns:wpg="http://schemas.microsoft.com/office/word/2010/wordprocessingGroup" xmlns:wpi="http://schemas.microsoft.com/office/word/2010/wordprocessingInk" xmlns:wne="http://schemas.microsoft.com/office/word/2006/wordml" xmlns:wps="http://schemas.microsoft.com/office/word/2010/wordprocessingShape" mc:Ignorable="w14 w15 w16se w16cid w16 w16cex w16sdtdh w16sdtfl w16du wp14">
+  <w:p>
+    <w:pPr>
+      <w:pStyle w:val="ad"/>
+    </w:pPr>
+  </w:p>
+</w:hdr>
+</file>
+
+<file path=word/header2.xml><?xml version="1.0" encoding="utf-8"?>
+<w:hdr xmlns:wpc="http://schemas.microsoft.com/office/word/2010/wordprocessingCanvas" xmlns:cx="http://schemas.microsoft.com/office/drawing/2014/chartex" xmlns:cx1="http://schemas.microsoft.com/office/drawing/2015/9/8/chartex" xmlns:cx2="http://schemas.microsoft.com/office/drawing/2015/10/21/chartex" xmlns:cx3="http://schemas.microsoft.com/office/drawing/2016/5/9/chartex" xmlns:cx4="http://schemas.microsoft.com/office/drawing/2016/5/10/chartex" xmlns:cx5="http://schemas.microsoft.com/office/drawing/2016/5/11/chartex" xmlns:cx6="http://schemas.microsoft.com/office/drawing/2016/5/12/chartex" xmlns:cx7="http://schemas.microsoft.com/office/drawing/2016/5/13/chartex" xmlns:cx8="http://schemas.microsoft.com/office/drawing/2016/5/14/chartex" xmlns:mc="http://schemas.openxmlformats.org/markup-compatibility/2006" xmlns:aink="http://schemas.microsoft.com/office/drawing/2016/ink" xmlns:am3d="http://schemas.microsoft.com/office/drawing/2017/model3d" xmlns:o="urn:schemas-microsoft-com:office:office" xmlns:oel="http://schemas.microsoft.com/office/2019/extlst" xmlns:r="http://schemas.openxmlformats.org/officeDocument/2006/relationships" xmlns:m="http://schemas.openxmlformats.org/officeDocument/2006/math" xmlns:v="urn:schemas-microsoft-com:vml" xmlns:wp14="http://schemas.microsoft.com/office/word/2010/wordprocessingDrawing" xmlns:wp="http://schemas.openxmlformats.org/drawingml/2006/wordprocessingDrawing" xmlns:w10="urn:schemas-microsoft-com:office:word" xmlns:w="http://schemas.openxmlformats.org/wordprocessingml/2006/main" xmlns:w14="http://schemas.microsoft.com/office/word/2010/wordml" xmlns:w15="http://schemas.microsoft.com/office/word/2012/wordml" xmlns:w16cex="http://schemas.microsoft.com/office/word/2018/wordml/cex" xmlns:w16cid="http://schemas.microsoft.com/office/word/2016/wordml/cid" xmlns:w16="http://schemas.microsoft.com/office/word/2018/wordml" xmlns:w16du="http://schemas.microsoft.com/office/word/2023/wordml/word16du" xmlns:w16sdtdh="http://schemas.microsoft.com/office/word/2020/wordml/sdtdatahash" xmlns:w16sdtfl="http://schemas.microsoft.com/office/word/2024/wordml/sdtformatlock" xmlns:w16se="http://schemas.microsoft.com/office/word/2015/wordml/symex" xmlns:wpg="http://schemas.microsoft.com/office/word/2010/wordprocessingGroup" xmlns:wpi="http://schemas.microsoft.com/office/word/2010/wordprocessingInk" xmlns:wne="http://schemas.microsoft.com/office/word/2006/wordml" xmlns:wps="http://schemas.microsoft.com/office/word/2010/wordprocessingShape" mc:Ignorable="w14 w15 w16se w16cid w16 w16cex w16sdtdh w16sdtfl w16du wp14">
+  <w:p>
+    <w:pPr>
+      <w:pStyle w:val="ad"/>
+    </w:pPr>
+  </w:p>
+</w:hdr>
+</file>
+
+<file path=word/header3.xml><?xml version="1.0" encoding="utf-8"?>
+<w:hdr xmlns:wpc="http://schemas.microsoft.com/office/word/2010/wordprocessingCanvas" xmlns:cx="http://schemas.microsoft.com/office/drawing/2014/chartex" xmlns:cx1="http://schemas.microsoft.com/office/drawing/2015/9/8/chartex" xmlns:cx2="http://schemas.microsoft.com/office/drawing/2015/10/21/chartex" xmlns:cx3="http://schemas.microsoft.com/office/drawing/2016/5/9/chartex" xmlns:cx4="http://schemas.microsoft.com/office/drawing/2016/5/10/chartex" xmlns:cx5="http://schemas.microsoft.com/office/drawing/2016/5/11/chartex" xmlns:cx6="http://schemas.microsoft.com/office/drawing/2016/5/12/chartex" xmlns:cx7="http://schemas.microsoft.com/office/drawing/2016/5/13/chartex" xmlns:cx8="http://schemas.microsoft.com/office/drawing/2016/5/14/chartex" xmlns:mc="http://schemas.openxmlformats.org/markup-compatibility/2006" xmlns:aink="http://schemas.microsoft.com/office/drawing/2016/ink" xmlns:am3d="http://schemas.microsoft.com/office/drawing/2017/model3d" xmlns:o="urn:schemas-microsoft-com:office:office" xmlns:oel="http://schemas.microsoft.com/office/2019/extlst" xmlns:r="http://schemas.openxmlformats.org/officeDocument/2006/relationships" xmlns:m="http://schemas.openxmlformats.org/officeDocument/2006/math" xmlns:v="urn:schemas-microsoft-com:vml" xmlns:wp14="http://schemas.microsoft.com/office/word/2010/wordprocessingDrawing" xmlns:wp="http://schemas.openxmlformats.org/drawingml/2006/wordprocessingDrawing" xmlns:w10="urn:schemas-microsoft-com:office:word" xmlns:w="http://schemas.openxmlformats.org/wordprocessingml/2006/main" xmlns:w14="http://schemas.microsoft.com/office/word/2010/wordml" xmlns:w15="http://schemas.microsoft.com/office/word/2012/wordml" xmlns:w16cex="http://schemas.microsoft.com/office/word/2018/wordml/cex" xmlns:w16cid="http://schemas.microsoft.com/office/word/2016/wordml/cid" xmlns:w16="http://schemas.microsoft.com/office/word/2018/wordml" xmlns:w16du="http://schemas.microsoft.com/office/word/2023/wordml/word16du" xmlns:w16sdtdh="http://schemas.microsoft.com/office/word/2020/wordml/sdtdatahash" xmlns:w16sdtfl="http://schemas.microsoft.com/office/word/2024/wordml/sdtformatlock" xmlns:w16se="http://schemas.microsoft.com/office/word/2015/wordml/symex" xmlns:wpg="http://schemas.microsoft.com/office/word/2010/wordprocessingGroup" xmlns:wpi="http://schemas.microsoft.com/office/word/2010/wordprocessingInk" xmlns:wne="http://schemas.microsoft.com/office/word/2006/wordml" xmlns:wps="http://schemas.microsoft.com/office/word/2010/wordprocessingShape" mc:Ignorable="w14 w15 w16se w16cid w16 w16cex w16sdtdh w16sdtfl w16du wp14">
+  <w:p>
+    <w:pPr>
+      <w:pStyle w:val="ad"/>
+    </w:pPr>
+  </w:p>
+</w:hdr>
 </file>
 
 <file path=word/numbering.xml><?xml version="1.0" encoding="utf-8"?>
@@ -4118,7 +4798,7 @@
         <v:path o:extrusionok="f" gradientshapeok="t" o:connecttype="rect"/>
         <o:lock v:ext="edit" aspectratio="t"/>
       </v:shapetype>
-      <v:shape id="_x0000_i1029" type="#_x0000_t75" style="width:12pt;height:12pt" o:bullet="t">
+      <v:shape id="_x0000_i1067" type="#_x0000_t75" style="width:12pt;height:12pt" o:bullet="t">
         <v:imagedata r:id="rId1" o:title="msoADA8"/>
       </v:shape>
     </w:pict>
@@ -6264,6 +6944,50 @@
       </w:tblBorders>
     </w:tblPr>
   </w:style>
+  <w:style w:type="paragraph" w:styleId="ad">
+    <w:name w:val="header"/>
+    <w:basedOn w:val="a"/>
+    <w:link w:val="ae"/>
+    <w:uiPriority w:val="99"/>
+    <w:unhideWhenUsed/>
+    <w:rsid w:val="00BB40C9"/>
+    <w:pPr>
+      <w:tabs>
+        <w:tab w:val="center" w:pos="4677"/>
+        <w:tab w:val="right" w:pos="9355"/>
+      </w:tabs>
+      <w:spacing w:after="0" w:line="240" w:lineRule="auto"/>
+    </w:pPr>
+  </w:style>
+  <w:style w:type="character" w:customStyle="1" w:styleId="ae">
+    <w:name w:val="Верхний колонтитул Знак"/>
+    <w:basedOn w:val="a0"/>
+    <w:link w:val="ad"/>
+    <w:uiPriority w:val="99"/>
+    <w:rsid w:val="00BB40C9"/>
+  </w:style>
+  <w:style w:type="paragraph" w:styleId="af">
+    <w:name w:val="footer"/>
+    <w:basedOn w:val="a"/>
+    <w:link w:val="af0"/>
+    <w:uiPriority w:val="99"/>
+    <w:unhideWhenUsed/>
+    <w:rsid w:val="00BB40C9"/>
+    <w:pPr>
+      <w:tabs>
+        <w:tab w:val="center" w:pos="4677"/>
+        <w:tab w:val="right" w:pos="9355"/>
+      </w:tabs>
+      <w:spacing w:after="0" w:line="240" w:lineRule="auto"/>
+    </w:pPr>
+  </w:style>
+  <w:style w:type="character" w:customStyle="1" w:styleId="af0">
+    <w:name w:val="Нижний колонтитул Знак"/>
+    <w:basedOn w:val="a0"/>
+    <w:link w:val="af"/>
+    <w:uiPriority w:val="99"/>
+    <w:rsid w:val="00BB40C9"/>
+  </w:style>
 </w:styles>
 </file>
 

</xml_diff>